<commit_message>
docs: exportar Word actualizado (memoria v3.4, piloto M2, términos confianza).
Co-authored-by: Cursor <cursoragent@cursor.com>
</commit_message>
<xml_diff>
--- a/docs/Canvas-Resumen-Uber-Truck.docx
+++ b/docs/Canvas-Resumen-Uber-Truck.docx
@@ -614,26 +614,26 @@
             </w:pPr>
             <w:r>
               <w:rPr/>
-              <w:t xml:space="preserve">M2 20 emparejamientos concierge</w:t>
-            </w:r>
-          </w:p>
-        </w:tc>
-        <w:tc>
-          <w:tcPr>
-            <w:tcBorders>
-              <w:top w:val="single" w:sz="1" w:space="0" w:color="000000"/>
-              <w:bottom w:val="single" w:sz="1" w:space="0" w:color="000000"/>
-              <w:left w:val="single" w:sz="1" w:space="0" w:color="000000"/>
-              <w:right w:val="single" w:sz="1" w:space="0" w:color="000000"/>
-            </w:tcBorders>
-          </w:tcPr>
-          <w:p>
-            <w:pPr>
-              <w:spacing w:lineRule="auto"/>
-            </w:pPr>
-            <w:r>
-              <w:rPr/>
-              <w:t xml:space="preserve">09-ago-2026</w:t>
+              <w:t xml:space="preserve">M2 20 viajes en la app</w:t>
+            </w:r>
+          </w:p>
+        </w:tc>
+        <w:tc>
+          <w:tcPr>
+            <w:tcBorders>
+              <w:top w:val="single" w:sz="1" w:space="0" w:color="000000"/>
+              <w:bottom w:val="single" w:sz="1" w:space="0" w:color="000000"/>
+              <w:left w:val="single" w:sz="1" w:space="0" w:color="000000"/>
+              <w:right w:val="single" w:sz="1" w:space="0" w:color="000000"/>
+            </w:tcBorders>
+          </w:tcPr>
+          <w:p>
+            <w:pPr>
+              <w:spacing w:lineRule="auto"/>
+            </w:pPr>
+            <w:r>
+              <w:rPr/>
+              <w:t xml:space="preserve">31-ago-2026</w:t>
             </w:r>
           </w:p>
         </w:tc>
@@ -799,20 +799,16 @@
       </w:pPr>
       <w:r>
         <w:rPr/>
-        <w:t xml:space="preserve">Detalle técnico: </w:t>
-      </w:r>
-      <w:r>
-        <w:rPr/>
-        <w:t xml:space="preserve">docs/Memoria-tecnica-Uber-Truck.html</w:t>
-      </w:r>
-      <w:r>
-        <w:rPr/>
-        <w:t xml:space="preserve"> · Bitácora: </w:t>
-      </w:r>
-      <w:r>
-        <w:rPr/>
-        <w:t xml:space="preserve">docs/HITO-DIGITAL-MVP.md</w:t>
-      </w:r>
+        <w:t xml:space="preserve">Detalle completo: </w:t>
+      </w:r>
+      <w:hyperlink r:id="rId6">
+        <w:r>
+          <w:rPr>
+            <w:rStyle w:val="Hyperlink"/>
+          </w:rPr>
+          <w:t xml:space="preserve">Memoria-tecnica-Uber-Truck.html</w:t>
+        </w:r>
+      </w:hyperlink>
     </w:p>
   </w:body>
 </w:document>

</xml_diff>